<commit_message>
Finalize CSE310 Week 01 project
</commit_message>
<xml_diff>
--- a/W01-Hello-World-Portfolio.docx
+++ b/W01-Hello-World-Portfolio.docx
@@ -20,7 +20,7 @@
     </w:p>
     <w:p>
       <w:r>
-        <w:t>Name: [Your Full Name]</w:t>
+        <w:t>Name: George Mike Okello</w:t>
       </w:r>
     </w:p>
     <w:p>
@@ -35,7 +35,7 @@
     </w:p>
     <w:p>
       <w:r>
-        <w:t>Date Submitted: September 1, 2026</w:t>
+        <w:t>Date Submitted: September 7, 2026</w:t>
       </w:r>
     </w:p>
     <w:p/>
@@ -57,7 +57,7 @@
     </w:p>
     <w:p>
       <w:r>
-        <w:t>https://github.com/your-username/hello-world</w:t>
+        <w:t>https://github.com/mikeokello/cse310-applied-programming-</w:t>
       </w:r>
     </w:p>
     <w:p/>
@@ -105,7 +105,7 @@
     </w:p>
     <w:p>
       <w:r>
-        <w:t>https://github.com/your-username/hello-world/blob/main/README.md</w:t>
+        <w:t>https://github.com/mikeokello/cse310-applied-programming-/blob/main/README.md</w:t>
       </w:r>
     </w:p>
     <w:p/>
@@ -248,13 +248,13 @@
     </w:p>
     <w:p>
       <w:r>
-        <w:t>I spent approximately 1 hour completing this assignment, including setup, coding, documentation, and video preparation.</w:t>
-      </w:r>
-    </w:p>
-    <w:p/>
-    <w:p>
-      <w:r>
-        <w:t>Hours Reported: 1</w:t>
+        <w:t>I spent approximately 2 hours completing this assignment, including setup, coding, documentation, and video preparation.</w:t>
+      </w:r>
+    </w:p>
+    <w:p/>
+    <w:p>
+      <w:r>
+        <w:t>Hours Reported: 2</w:t>
       </w:r>
     </w:p>
     <w:p/>

</xml_diff>